<commit_message>
fixed tests in angular
</commit_message>
<xml_diff>
--- a/Angular/Results.docx
+++ b/Angular/Results.docx
@@ -1250,6 +1250,7 @@
           <w:rFonts w:ascii="Times New Roman" w:hAnsi="Times New Roman" w:cs="Times New Roman"/>
           <w:b/>
           <w:bCs/>
+          <w:noProof/>
           <w:sz w:val="28"/>
           <w:szCs w:val="28"/>
         </w:rPr>
@@ -1326,6 +1327,7 @@
           <w:rFonts w:ascii="Times New Roman" w:hAnsi="Times New Roman" w:cs="Times New Roman"/>
           <w:b/>
           <w:bCs/>
+          <w:noProof/>
           <w:sz w:val="28"/>
           <w:szCs w:val="28"/>
         </w:rPr>
@@ -1381,6 +1383,7 @@
           <w:rFonts w:ascii="Times New Roman" w:hAnsi="Times New Roman" w:cs="Times New Roman"/>
           <w:b/>
           <w:bCs/>
+          <w:noProof/>
           <w:sz w:val="28"/>
           <w:szCs w:val="28"/>
         </w:rPr>
@@ -1462,24 +1465,45 @@
           <w:szCs w:val="28"/>
         </w:rPr>
         <w:lastRenderedPageBreak/>
-        <w:t>Hands-On 8 Part 3</w:t>
-      </w:r>
-    </w:p>
-    <w:p>
-      <w:pPr>
-        <w:rPr>
-          <w:rFonts w:ascii="Times New Roman" w:hAnsi="Times New Roman" w:cs="Times New Roman"/>
-          <w:b/>
-          <w:bCs/>
-          <w:sz w:val="28"/>
-          <w:szCs w:val="28"/>
-        </w:rPr>
-      </w:pPr>
-      <w:r>
-        <w:rPr>
-          <w:rFonts w:ascii="Times New Roman" w:hAnsi="Times New Roman" w:cs="Times New Roman"/>
-          <w:b/>
-          <w:bCs/>
+        <w:t xml:space="preserve">Hands-On 8 </w:t>
+      </w:r>
+      <w:r>
+        <w:rPr>
+          <w:rFonts w:ascii="Times New Roman" w:hAnsi="Times New Roman" w:cs="Times New Roman"/>
+          <w:b/>
+          <w:bCs/>
+          <w:sz w:val="28"/>
+          <w:szCs w:val="28"/>
+        </w:rPr>
+        <w:t>Task</w:t>
+      </w:r>
+      <w:r>
+        <w:rPr>
+          <w:rFonts w:ascii="Times New Roman" w:hAnsi="Times New Roman" w:cs="Times New Roman"/>
+          <w:b/>
+          <w:bCs/>
+          <w:sz w:val="28"/>
+          <w:szCs w:val="28"/>
+        </w:rPr>
+        <w:t xml:space="preserve"> 3</w:t>
+      </w:r>
+    </w:p>
+    <w:p>
+      <w:pPr>
+        <w:rPr>
+          <w:rFonts w:ascii="Times New Roman" w:hAnsi="Times New Roman" w:cs="Times New Roman"/>
+          <w:b/>
+          <w:bCs/>
+          <w:sz w:val="28"/>
+          <w:szCs w:val="28"/>
+        </w:rPr>
+      </w:pPr>
+      <w:r>
+        <w:rPr>
+          <w:rFonts w:ascii="Times New Roman" w:hAnsi="Times New Roman" w:cs="Times New Roman"/>
+          <w:b/>
+          <w:bCs/>
+          <w:noProof/>
           <w:sz w:val="28"/>
           <w:szCs w:val="28"/>
         </w:rPr>
@@ -1535,6 +1559,7 @@
           <w:rFonts w:ascii="Times New Roman" w:hAnsi="Times New Roman" w:cs="Times New Roman"/>
           <w:b/>
           <w:bCs/>
+          <w:noProof/>
           <w:sz w:val="28"/>
           <w:szCs w:val="28"/>
         </w:rPr>
@@ -1573,6 +1598,386 @@
             </a:graphic>
           </wp:inline>
         </w:drawing>
+      </w:r>
+    </w:p>
+    <w:p>
+      <w:pPr>
+        <w:rPr>
+          <w:rFonts w:ascii="Times New Roman" w:hAnsi="Times New Roman" w:cs="Times New Roman"/>
+          <w:b/>
+          <w:bCs/>
+          <w:sz w:val="28"/>
+          <w:szCs w:val="28"/>
+        </w:rPr>
+      </w:pPr>
+      <w:r>
+        <w:rPr>
+          <w:rFonts w:ascii="Times New Roman" w:hAnsi="Times New Roman" w:cs="Times New Roman"/>
+          <w:b/>
+          <w:bCs/>
+          <w:sz w:val="28"/>
+          <w:szCs w:val="28"/>
+        </w:rPr>
+        <w:t xml:space="preserve">Hands-On 9 </w:t>
+      </w:r>
+      <w:r>
+        <w:rPr>
+          <w:rFonts w:ascii="Times New Roman" w:hAnsi="Times New Roman" w:cs="Times New Roman"/>
+          <w:b/>
+          <w:bCs/>
+          <w:sz w:val="28"/>
+          <w:szCs w:val="28"/>
+        </w:rPr>
+        <w:t>Task</w:t>
+      </w:r>
+      <w:r>
+        <w:rPr>
+          <w:rFonts w:ascii="Times New Roman" w:hAnsi="Times New Roman" w:cs="Times New Roman"/>
+          <w:b/>
+          <w:bCs/>
+          <w:sz w:val="28"/>
+          <w:szCs w:val="28"/>
+        </w:rPr>
+        <w:t xml:space="preserve"> 1</w:t>
+      </w:r>
+    </w:p>
+    <w:p>
+      <w:pPr>
+        <w:rPr>
+          <w:rFonts w:ascii="Times New Roman" w:hAnsi="Times New Roman" w:cs="Times New Roman"/>
+          <w:b/>
+          <w:bCs/>
+          <w:sz w:val="28"/>
+          <w:szCs w:val="28"/>
+        </w:rPr>
+      </w:pPr>
+      <w:r>
+        <w:rPr>
+          <w:rFonts w:ascii="Times New Roman" w:hAnsi="Times New Roman" w:cs="Times New Roman"/>
+          <w:b/>
+          <w:bCs/>
+          <w:sz w:val="28"/>
+          <w:szCs w:val="28"/>
+        </w:rPr>
+        <w:drawing>
+          <wp:inline distT="0" distB="0" distL="0" distR="0" wp14:anchorId="2DA7CA40" wp14:editId="408FE13E">
+            <wp:extent cx="5731510" cy="2834005"/>
+            <wp:effectExtent l="0" t="0" r="2540" b="4445"/>
+            <wp:docPr id="569783603" name="Picture 1"/>
+            <wp:cNvGraphicFramePr>
+              <a:graphicFrameLocks xmlns:a="http://schemas.openxmlformats.org/drawingml/2006/main" noChangeAspect="1"/>
+            </wp:cNvGraphicFramePr>
+            <a:graphic xmlns:a="http://schemas.openxmlformats.org/drawingml/2006/main">
+              <a:graphicData uri="http://schemas.openxmlformats.org/drawingml/2006/picture">
+                <pic:pic xmlns:pic="http://schemas.openxmlformats.org/drawingml/2006/picture">
+                  <pic:nvPicPr>
+                    <pic:cNvPr id="569783603" name=""/>
+                    <pic:cNvPicPr/>
+                  </pic:nvPicPr>
+                  <pic:blipFill>
+                    <a:blip r:embed="rId25"/>
+                    <a:stretch>
+                      <a:fillRect/>
+                    </a:stretch>
+                  </pic:blipFill>
+                  <pic:spPr>
+                    <a:xfrm>
+                      <a:off x="0" y="0"/>
+                      <a:ext cx="5731510" cy="2834005"/>
+                    </a:xfrm>
+                    <a:prstGeom prst="rect">
+                      <a:avLst/>
+                    </a:prstGeom>
+                  </pic:spPr>
+                </pic:pic>
+              </a:graphicData>
+            </a:graphic>
+          </wp:inline>
+        </w:drawing>
+      </w:r>
+    </w:p>
+    <w:p>
+      <w:pPr>
+        <w:rPr>
+          <w:rFonts w:ascii="Times New Roman" w:hAnsi="Times New Roman" w:cs="Times New Roman"/>
+          <w:b/>
+          <w:bCs/>
+          <w:sz w:val="28"/>
+          <w:szCs w:val="28"/>
+        </w:rPr>
+      </w:pPr>
+      <w:r>
+        <w:rPr>
+          <w:rFonts w:ascii="Times New Roman" w:hAnsi="Times New Roman" w:cs="Times New Roman"/>
+          <w:b/>
+          <w:bCs/>
+          <w:sz w:val="28"/>
+          <w:szCs w:val="28"/>
+        </w:rPr>
+        <w:lastRenderedPageBreak/>
+        <w:t>Hands-On 9 Task 2</w:t>
+      </w:r>
+    </w:p>
+    <w:p>
+      <w:pPr>
+        <w:rPr>
+          <w:rFonts w:ascii="Times New Roman" w:hAnsi="Times New Roman" w:cs="Times New Roman"/>
+          <w:b/>
+          <w:bCs/>
+          <w:sz w:val="28"/>
+          <w:szCs w:val="28"/>
+        </w:rPr>
+      </w:pPr>
+      <w:r>
+        <w:rPr>
+          <w:noProof/>
+        </w:rPr>
+        <w:drawing>
+          <wp:inline distT="0" distB="0" distL="0" distR="0" wp14:anchorId="14E2932C" wp14:editId="2996643F">
+            <wp:extent cx="4495800" cy="2187132"/>
+            <wp:effectExtent l="0" t="0" r="0" b="3810"/>
+            <wp:docPr id="1783467132" name="Picture 1"/>
+            <wp:cNvGraphicFramePr>
+              <a:graphicFrameLocks xmlns:a="http://schemas.openxmlformats.org/drawingml/2006/main" noChangeAspect="1"/>
+            </wp:cNvGraphicFramePr>
+            <a:graphic xmlns:a="http://schemas.openxmlformats.org/drawingml/2006/main">
+              <a:graphicData uri="http://schemas.openxmlformats.org/drawingml/2006/picture">
+                <pic:pic xmlns:pic="http://schemas.openxmlformats.org/drawingml/2006/picture">
+                  <pic:nvPicPr>
+                    <pic:cNvPr id="1783467132" name=""/>
+                    <pic:cNvPicPr/>
+                  </pic:nvPicPr>
+                  <pic:blipFill>
+                    <a:blip r:embed="rId26"/>
+                    <a:stretch>
+                      <a:fillRect/>
+                    </a:stretch>
+                  </pic:blipFill>
+                  <pic:spPr>
+                    <a:xfrm>
+                      <a:off x="0" y="0"/>
+                      <a:ext cx="4509428" cy="2193762"/>
+                    </a:xfrm>
+                    <a:prstGeom prst="rect">
+                      <a:avLst/>
+                    </a:prstGeom>
+                  </pic:spPr>
+                </pic:pic>
+              </a:graphicData>
+            </a:graphic>
+          </wp:inline>
+        </w:drawing>
+      </w:r>
+    </w:p>
+    <w:p>
+      <w:pPr>
+        <w:rPr>
+          <w:rFonts w:ascii="Times New Roman" w:hAnsi="Times New Roman" w:cs="Times New Roman"/>
+          <w:b/>
+          <w:bCs/>
+          <w:sz w:val="28"/>
+          <w:szCs w:val="28"/>
+        </w:rPr>
+      </w:pPr>
+      <w:r>
+        <w:rPr>
+          <w:noProof/>
+        </w:rPr>
+        <w:drawing>
+          <wp:inline distT="0" distB="0" distL="0" distR="0" wp14:anchorId="57C50952" wp14:editId="3CE86A25">
+            <wp:extent cx="4527550" cy="2134861"/>
+            <wp:effectExtent l="0" t="0" r="6350" b="0"/>
+            <wp:docPr id="1379930185" name="Picture 1"/>
+            <wp:cNvGraphicFramePr>
+              <a:graphicFrameLocks xmlns:a="http://schemas.openxmlformats.org/drawingml/2006/main" noChangeAspect="1"/>
+            </wp:cNvGraphicFramePr>
+            <a:graphic xmlns:a="http://schemas.openxmlformats.org/drawingml/2006/main">
+              <a:graphicData uri="http://schemas.openxmlformats.org/drawingml/2006/picture">
+                <pic:pic xmlns:pic="http://schemas.openxmlformats.org/drawingml/2006/picture">
+                  <pic:nvPicPr>
+                    <pic:cNvPr id="1379930185" name=""/>
+                    <pic:cNvPicPr/>
+                  </pic:nvPicPr>
+                  <pic:blipFill>
+                    <a:blip r:embed="rId27"/>
+                    <a:stretch>
+                      <a:fillRect/>
+                    </a:stretch>
+                  </pic:blipFill>
+                  <pic:spPr>
+                    <a:xfrm>
+                      <a:off x="0" y="0"/>
+                      <a:ext cx="4534565" cy="2138169"/>
+                    </a:xfrm>
+                    <a:prstGeom prst="rect">
+                      <a:avLst/>
+                    </a:prstGeom>
+                  </pic:spPr>
+                </pic:pic>
+              </a:graphicData>
+            </a:graphic>
+          </wp:inline>
+        </w:drawing>
+      </w:r>
+    </w:p>
+    <w:p>
+      <w:pPr>
+        <w:rPr>
+          <w:rFonts w:ascii="Times New Roman" w:hAnsi="Times New Roman" w:cs="Times New Roman"/>
+          <w:b/>
+          <w:bCs/>
+          <w:sz w:val="28"/>
+          <w:szCs w:val="28"/>
+        </w:rPr>
+      </w:pPr>
+      <w:r>
+        <w:rPr>
+          <w:rFonts w:ascii="Times New Roman" w:hAnsi="Times New Roman" w:cs="Times New Roman"/>
+          <w:b/>
+          <w:bCs/>
+          <w:sz w:val="28"/>
+          <w:szCs w:val="28"/>
+        </w:rPr>
+        <w:t xml:space="preserve">Hands-On 10 </w:t>
+      </w:r>
+    </w:p>
+    <w:p>
+      <w:pPr>
+        <w:rPr>
+          <w:rFonts w:ascii="Times New Roman" w:hAnsi="Times New Roman" w:cs="Times New Roman"/>
+          <w:b/>
+          <w:bCs/>
+          <w:sz w:val="28"/>
+          <w:szCs w:val="28"/>
+        </w:rPr>
+      </w:pPr>
+      <w:r>
+        <w:rPr>
+          <w:rFonts w:ascii="Times New Roman" w:hAnsi="Times New Roman" w:cs="Times New Roman"/>
+          <w:b/>
+          <w:bCs/>
+          <w:sz w:val="28"/>
+          <w:szCs w:val="28"/>
+        </w:rPr>
+        <w:drawing>
+          <wp:inline distT="0" distB="0" distL="0" distR="0" wp14:anchorId="71900133" wp14:editId="2394A031">
+            <wp:extent cx="5731510" cy="2519045"/>
+            <wp:effectExtent l="0" t="0" r="2540" b="0"/>
+            <wp:docPr id="1316302162" name="Picture 1"/>
+            <wp:cNvGraphicFramePr>
+              <a:graphicFrameLocks xmlns:a="http://schemas.openxmlformats.org/drawingml/2006/main" noChangeAspect="1"/>
+            </wp:cNvGraphicFramePr>
+            <a:graphic xmlns:a="http://schemas.openxmlformats.org/drawingml/2006/main">
+              <a:graphicData uri="http://schemas.openxmlformats.org/drawingml/2006/picture">
+                <pic:pic xmlns:pic="http://schemas.openxmlformats.org/drawingml/2006/picture">
+                  <pic:nvPicPr>
+                    <pic:cNvPr id="1316302162" name=""/>
+                    <pic:cNvPicPr/>
+                  </pic:nvPicPr>
+                  <pic:blipFill>
+                    <a:blip r:embed="rId28"/>
+                    <a:stretch>
+                      <a:fillRect/>
+                    </a:stretch>
+                  </pic:blipFill>
+                  <pic:spPr>
+                    <a:xfrm>
+                      <a:off x="0" y="0"/>
+                      <a:ext cx="5731510" cy="2519045"/>
+                    </a:xfrm>
+                    <a:prstGeom prst="rect">
+                      <a:avLst/>
+                    </a:prstGeom>
+                  </pic:spPr>
+                </pic:pic>
+              </a:graphicData>
+            </a:graphic>
+          </wp:inline>
+        </w:drawing>
+      </w:r>
+    </w:p>
+    <w:p>
+      <w:pPr>
+        <w:rPr>
+          <w:rFonts w:ascii="Times New Roman" w:hAnsi="Times New Roman" w:cs="Times New Roman"/>
+          <w:b/>
+          <w:bCs/>
+          <w:sz w:val="28"/>
+          <w:szCs w:val="28"/>
+        </w:rPr>
+      </w:pPr>
+    </w:p>
+    <w:p>
+      <w:pPr>
+        <w:rPr>
+          <w:rFonts w:ascii="Times New Roman" w:hAnsi="Times New Roman" w:cs="Times New Roman"/>
+          <w:b/>
+          <w:bCs/>
+          <w:sz w:val="28"/>
+          <w:szCs w:val="28"/>
+        </w:rPr>
+      </w:pPr>
+    </w:p>
+    <w:p>
+      <w:pPr>
+        <w:rPr>
+          <w:rFonts w:ascii="Times New Roman" w:hAnsi="Times New Roman" w:cs="Times New Roman"/>
+          <w:b/>
+          <w:bCs/>
+          <w:sz w:val="28"/>
+          <w:szCs w:val="28"/>
+        </w:rPr>
+      </w:pPr>
+      <w:r>
+        <w:rPr>
+          <w:noProof/>
+        </w:rPr>
+        <w:lastRenderedPageBreak/>
+        <w:drawing>
+          <wp:inline distT="0" distB="0" distL="0" distR="0" wp14:anchorId="7C3147D3" wp14:editId="74548CF2">
+            <wp:extent cx="5731510" cy="2750820"/>
+            <wp:effectExtent l="0" t="0" r="2540" b="0"/>
+            <wp:docPr id="820099653" name="Picture 1"/>
+            <wp:cNvGraphicFramePr>
+              <a:graphicFrameLocks xmlns:a="http://schemas.openxmlformats.org/drawingml/2006/main" noChangeAspect="1"/>
+            </wp:cNvGraphicFramePr>
+            <a:graphic xmlns:a="http://schemas.openxmlformats.org/drawingml/2006/main">
+              <a:graphicData uri="http://schemas.openxmlformats.org/drawingml/2006/picture">
+                <pic:pic xmlns:pic="http://schemas.openxmlformats.org/drawingml/2006/picture">
+                  <pic:nvPicPr>
+                    <pic:cNvPr id="820099653" name=""/>
+                    <pic:cNvPicPr/>
+                  </pic:nvPicPr>
+                  <pic:blipFill>
+                    <a:blip r:embed="rId29"/>
+                    <a:stretch>
+                      <a:fillRect/>
+                    </a:stretch>
+                  </pic:blipFill>
+                  <pic:spPr>
+                    <a:xfrm>
+                      <a:off x="0" y="0"/>
+                      <a:ext cx="5731510" cy="2750820"/>
+                    </a:xfrm>
+                    <a:prstGeom prst="rect">
+                      <a:avLst/>
+                    </a:prstGeom>
+                  </pic:spPr>
+                </pic:pic>
+              </a:graphicData>
+            </a:graphic>
+          </wp:inline>
+        </w:drawing>
+      </w:r>
+      <w:r>
+        <w:rPr>
+          <w:rFonts w:ascii="Times New Roman" w:hAnsi="Times New Roman" w:cs="Times New Roman"/>
+          <w:b/>
+          <w:bCs/>
+          <w:sz w:val="28"/>
+          <w:szCs w:val="28"/>
+        </w:rPr>
+        <w:br/>
       </w:r>
     </w:p>
     <w:p>

</xml_diff>